<commit_message>
W8 materials updated Oct 26th 2026
</commit_message>
<xml_diff>
--- a/lectures/week08/Week8_Lecture.docx
+++ b/lectures/week08/Week8_Lecture.docx
@@ -306,7 +306,7 @@
         </w:rPr>
         <w:t xml:space="preserve">·  </w:t>
       </w:r>
-      <w:hyperlink w:history="1" r:id="rIdf1ecgk4zw55lur-1ajdjy">
+      <w:hyperlink w:history="1" r:id="rId9nuac03pl1lmsgndg7zh7">
         <w:r>
           <w:rPr>
             <w:rFonts w:ascii="Cambria" w:cs="Cambria" w:eastAsia="Cambria" w:hAnsi="Cambria"/>
@@ -447,7 +447,7 @@
           <w:sz w:val="22"/>
           <w:szCs w:val="22"/>
         </w:rPr>
-        <w:t xml:space="preserve">·  Paillard, J. (1996). Fast and slow feedback loops for the visual correction of spatial errors in a pointing task: A reappraisal. Canadian Journal of Physiology and Pharmacology, 74, 401–417. — The two-channel account of central and peripheral vision; §5.</w:t>
+        <w:t xml:space="preserve">·  Paillard, J. (1996). Fast and slow feedback loops for the visual correction of spatial errors in a pointing task: A reappraisal. Canadian Journal of Physiology and Pharmacology, 74, 401–417. — The two-channel account of central and peripheral vision; §1, §1.3, §5.</w:t>
       </w:r>
     </w:p>
     <w:p>
@@ -3326,7 +3326,7 @@
           <w:sz w:val="22"/>
           <w:szCs w:val="22"/>
         </w:rPr>
-        <w:t xml:space="preserve">: central vision, around the point the eyes fixate, and peripheral vision, the rest of the visual field. Each is a sensor with its own delay and noise (Table 2).</w:t>
+        <w:t xml:space="preserve">: central vision, around the point the eyes fixate, and peripheral vision, the rest of the visual field. Each is a sensor with its own delay and noise (Table 2). Central vision's delay matches measured responses. Peripheral vision's values are the model's assumption, based on Paillard's (1996) proposal of a faster peripheral channel, not measurements (§1.3).</w:t>
       </w:r>
     </w:p>
     <w:p>
@@ -3471,7 +3471,7 @@
           <w:sz w:val="19"/>
           <w:szCs w:val="19"/>
         </w:rPr>
-        <w:t xml:space="preserve">The terms of Equation 8.1, with the values used for the two visual channels.</w:t>
+        <w:t xml:space="preserve">The terms of Equation 8.1, with the values used for the two visual channels. Peripheral vision's values are assumed (§1.3).</w:t>
       </w:r>
     </w:p>
     <w:tbl>
@@ -4372,7 +4372,7 @@
           <w:sz w:val="22"/>
           <w:szCs w:val="22"/>
         </w:rPr>
-        <w:t xml:space="preserve">Figure 2A runs both channels, central vision (150 ms, 1 mm) and peripheral vision (80 ms, 5 mm), on the 0° reach of 500 ms. Each channel's samples trail the hand. The gap is the distance the hand covers in one delay, and it is largest when the hand moves fastest (Figure 2B). Central vision reports a position up to 4.24 cm behind the hand, and peripheral vision up to 2.36 cm. The reach is 8 cm long, so at its fastest the central sample is about half a reach out of date.</w:t>
+        <w:t xml:space="preserve">Figure 2A runs both channels, central vision (150 ms, 1 mm) and peripheral vision (the assumed 80 ms and 5 mm), on the 0° reach of 500 ms. Each channel's samples trail the hand. The gap is the distance the hand covers in one delay, and it is largest when the hand moves fastest (Figure 2B). Central vision reports a position up to 4.24 cm behind the hand, and peripheral vision up to 2.36 cm. The reach is 8 cm long, so at its fastest the central sample is about half a reach out of date.</w:t>
       </w:r>
     </w:p>
     <w:p>
@@ -4388,7 +4388,7 @@
           <w:sz w:val="22"/>
           <w:szCs w:val="22"/>
         </w:rPr>
-        <w:t xml:space="preserve">These numbers measure lag, not precision. The gap is roughly the hand's speed multiplied by the delay. At the reach's peak speed of 0.30 m/s, 150 ms of delay is 4.5 cm and 80 ms is 2.4 cm. The measured gaps are a little smaller, because the hand moves more slowly on either side of its peak. Peripheral vision trails the hand less only because its delay is shorter. Each of its samples scatters five times more widely, with σ = 5 mm against 1 mm; this is the jitter in Figure 2A.</w:t>
+        <w:t xml:space="preserve">These numbers measure lag, not precision. The gap is roughly the hand's speed multiplied by the delay. At the reach's peak speed of 0.30 m/s, 150 ms of delay is 4.5 cm and 80 ms is 2.4 cm. The measured gaps are a little smaller, because the hand moves more slowly on either side of its peak. Peripheral vision trails the hand less only because its assumed delay is shorter. Each of its samples scatters five times more widely, with σ = 5 mm against 1 mm; this is the jitter in Figure 2A.</w:t>
       </w:r>
     </w:p>
     <w:p>
@@ -5866,7 +5866,7 @@
           <w:sz w:val="19"/>
           <w:szCs w:val="19"/>
         </w:rPr>
-        <w:t xml:space="preserve">What the sensor reports. A: the 0° reach of 500 ms (dark line) and the samples of central vision (150 ms, 1 mm) and peripheral vision (80 ms, 5 mm), one trial each; a new sample arrives every 10 ms. The bands show ± 1 SD of the noise around the hand's position Δ earlier: ± 1 mm for central vision, too narrow to see, and ± 5 mm for peripheral vision. Each step is one sample, and peripheral samples scatter five times more widely, which is why its trace is ragged. B: the distance between the hand and the hand Δ earlier, which is how far behind each channel is before noise; Δ is each channel's delay in Table 2. C: central vision's samples for a hand held still (thin line), with ± 1 SD (1 mm, light band), and their 100 ms running average (thick line), with ± 1 SD (0.32 mm, dark band); n = 10 samples per window.</w:t>
+        <w:t xml:space="preserve">What the sensor reports. A: the 0° reach of 500 ms (dark line) and the samples of central vision (150 ms, 1 mm) and peripheral vision (80 ms, 5 mm; assumed, §1.3), one trial each; a new sample arrives every 10 ms. The bands show ± 1 SD of the noise around the hand's position Δ earlier: ± 1 mm for central vision, too narrow to see, and ± 5 mm for peripheral vision. Each step is one sample, and peripheral samples scatter five times more widely, which is why its trace is ragged. B: the distance between the hand and the hand Δ earlier, which is how far behind each channel is before noise; Δ is each channel's delay in Table 2. C: central vision's samples for a hand held still (thin line), with ± 1 SD (1 mm, light band), and their 100 ms running average (thick line), with ± 1 SD (0.32 mm, dark band); n = 10 samples per window.</w:t>
       </w:r>
     </w:p>
     <w:p>
@@ -5963,7 +5963,7 @@
           <w:sz w:val="22"/>
           <w:szCs w:val="22"/>
         </w:rPr>
-        <w:t xml:space="preserve">Peripheral vision's 80 ms comes from the course outline and is the least certain value. It is close to Elliott et al.'s earliest regulation. Measured as central vision's delay is, to a change in force, it is longer.</w:t>
+        <w:t xml:space="preserve">Peripheral vision's values are not measurements. Its 80 ms expresses Paillard's (1996) proposal that peripheral vision, which detects the hand's motion, supports faster corrections than central vision (§5). It is the least certain value in the model. No study cited here measured the 5 mm.</w:t>
       </w:r>
     </w:p>
     <w:p>
@@ -5979,7 +5979,7 @@
           <w:sz w:val="22"/>
           <w:szCs w:val="22"/>
         </w:rPr>
-        <w:t xml:space="preserve">With the eyes on the target, a jump of the hand's cursor during a reach falls in peripheral vision. The corrective force at the hand then began after 138 ms (de Brouwer et al., 2018, p. 2527). Responses to perturbations of the seen hand began after 143–176 ms in Saunders and Knill's (2004) experiments (p. 3228).</w:t>
+        <w:t xml:space="preserve">The 80 ms is close to Elliott et al.'s earliest regulation. Measured as central vision's delay is, to a change in force, the peripheral delay is longer.</w:t>
       </w:r>
     </w:p>
     <w:p>
@@ -5995,7 +5995,23 @@
           <w:sz w:val="22"/>
           <w:szCs w:val="22"/>
         </w:rPr>
-        <w:t xml:space="preserve">The model keeps the outline's 80 ms, and §5 repeats the comparison with 140 ms, close to the measured value. No study cited here measured the delay and the noise of both channels in the same task.</w:t>
+        <w:t xml:space="preserve">With the eyes on the target, a jump of the hand's cursor during a reach falls in peripheral vision. The corrective force at the hand then began after 138 ms (de Brouwer et al., 2018, p. 2527). Responses to perturbations of the seen hand began after 143–176 ms in Saunders and Knill's (2004) experiments (p. 3228).</w:t>
+      </w:r>
+    </w:p>
+    <w:p>
+      <w:pPr>
+        <w:keepNext w:val="false"/>
+        <w:spacing w:after="140" w:before="0" w:line="276"/>
+        <w:jc w:val="left"/>
+      </w:pPr>
+      <w:r>
+        <w:rPr>
+          <w:rFonts w:ascii="Cambria" w:cs="Cambria" w:eastAsia="Cambria" w:hAnsi="Cambria"/>
+          <w:color w:val="333333"/>
+          <w:sz w:val="22"/>
+          <w:szCs w:val="22"/>
+        </w:rPr>
+        <w:t xml:space="preserve">The model keeps 80 ms to represent Paillard's proposal, and §5 repeats the comparison with 140 ms, close to the measured value. No study cited here measured the delay and the noise of both channels in the same task.</w:t>
       </w:r>
     </w:p>
     <w:p>
@@ -6493,7 +6509,7 @@
         </w:rPr>
         <w:t xml:space="preserve"> on its rate. The </w:t>
       </w:r>
-      <w:hyperlink w:history="1" r:id="rIdsgbks4mb11netjvn0fl-t">
+      <w:hyperlink w:history="1" r:id="rIdn5tyrdmlwu3ka4blvwrct">
         <w:r>
           <w:rPr>
             <w:rFonts w:ascii="Cambria" w:cs="Cambria" w:eastAsia="Cambria" w:hAnsi="Cambria"/>
@@ -6513,6 +6529,231 @@
           <w:szCs w:val="22"/>
         </w:rPr>
         <w:t xml:space="preserve"> handout explains P, PD, PI and PID controllers on a simpler example (Boards 5–9). This loop has no integral term, because the hand has no spring pulling it away from a still target (handout, Board 10).</w:t>
+      </w:r>
+    </w:p>
+    <w:p>
+      <w:pPr>
+        <w:keepNext w:val="false"/>
+        <w:spacing w:after="140" w:before="0" w:line="276"/>
+        <w:jc w:val="left"/>
+      </w:pPr>
+      <w:r>
+        <w:rPr>
+          <w:rFonts w:ascii="Cambria" w:cs="Cambria" w:eastAsia="Cambria" w:hAnsi="Cambria"/>
+          <w:color w:val="333333"/>
+          <w:sz w:val="22"/>
+          <w:szCs w:val="22"/>
+        </w:rPr>
+        <w:t xml:space="preserve">K</w:t>
+      </w:r>
+      <w:r>
+        <w:rPr>
+          <w:rFonts w:ascii="Cambria" w:cs="Cambria" w:eastAsia="Cambria" w:hAnsi="Cambria"/>
+          <w:color w:val="333333"/>
+          <w:sz w:val="22"/>
+          <w:szCs w:val="22"/>
+          <w:vertAlign w:val="subscript"/>
+        </w:rPr>
+        <w:t xml:space="preserve">p</w:t>
+      </w:r>
+      <w:r>
+        <w:rPr>
+          <w:rFonts w:ascii="Cambria" w:cs="Cambria" w:eastAsia="Cambria" w:hAnsi="Cambria"/>
+          <w:color w:val="333333"/>
+          <w:sz w:val="22"/>
+          <w:szCs w:val="22"/>
+        </w:rPr>
+        <w:t xml:space="preserve"> has units of 1/s² and K</w:t>
+      </w:r>
+      <w:r>
+        <w:rPr>
+          <w:rFonts w:ascii="Cambria" w:cs="Cambria" w:eastAsia="Cambria" w:hAnsi="Cambria"/>
+          <w:color w:val="333333"/>
+          <w:sz w:val="22"/>
+          <w:szCs w:val="22"/>
+          <w:vertAlign w:val="subscript"/>
+        </w:rPr>
+        <w:t xml:space="preserve">d</w:t>
+      </w:r>
+      <w:r>
+        <w:rPr>
+          <w:rFonts w:ascii="Cambria" w:cs="Cambria" w:eastAsia="Cambria" w:hAnsi="Cambria"/>
+          <w:color w:val="333333"/>
+          <w:sz w:val="22"/>
+          <w:szCs w:val="22"/>
+        </w:rPr>
+        <w:t xml:space="preserve"> of 1/s, because the command a is an acceleration. How large a gain the loop can use depends on its delay (§3), so the notes also give the gains in two dimensionless forms: κ = K</w:t>
+      </w:r>
+      <w:r>
+        <w:rPr>
+          <w:rFonts w:ascii="Cambria" w:cs="Cambria" w:eastAsia="Cambria" w:hAnsi="Cambria"/>
+          <w:color w:val="333333"/>
+          <w:sz w:val="22"/>
+          <w:szCs w:val="22"/>
+          <w:vertAlign w:val="subscript"/>
+        </w:rPr>
+        <w:t xml:space="preserve">p</w:t>
+      </w:r>
+      <w:r>
+        <w:rPr>
+          <w:rFonts w:ascii="Cambria" w:cs="Cambria" w:eastAsia="Cambria" w:hAnsi="Cambria"/>
+          <w:color w:val="333333"/>
+          <w:sz w:val="22"/>
+          <w:szCs w:val="22"/>
+        </w:rPr>
+        <w:t xml:space="preserve">Δ² and δ = K</w:t>
+      </w:r>
+      <w:r>
+        <w:rPr>
+          <w:rFonts w:ascii="Cambria" w:cs="Cambria" w:eastAsia="Cambria" w:hAnsi="Cambria"/>
+          <w:color w:val="333333"/>
+          <w:sz w:val="22"/>
+          <w:szCs w:val="22"/>
+          <w:vertAlign w:val="subscript"/>
+        </w:rPr>
+        <w:t xml:space="preserve">d</w:t>
+      </w:r>
+      <w:r>
+        <w:rPr>
+          <w:rFonts w:ascii="Cambria" w:cs="Cambria" w:eastAsia="Cambria" w:hAnsi="Cambria"/>
+          <w:color w:val="333333"/>
+          <w:sz w:val="22"/>
+          <w:szCs w:val="22"/>
+        </w:rPr>
+        <w:t xml:space="preserve">Δ. Holding each sample for T</w:t>
+      </w:r>
+      <w:r>
+        <w:rPr>
+          <w:rFonts w:ascii="Cambria" w:cs="Cambria" w:eastAsia="Cambria" w:hAnsi="Cambria"/>
+          <w:color w:val="333333"/>
+          <w:sz w:val="22"/>
+          <w:szCs w:val="22"/>
+          <w:vertAlign w:val="subscript"/>
+        </w:rPr>
+        <w:t xml:space="preserve">S</w:t>
+      </w:r>
+      <w:r>
+        <w:rPr>
+          <w:rFonts w:ascii="Cambria" w:cs="Cambria" w:eastAsia="Cambria" w:hAnsi="Cambria"/>
+          <w:color w:val="333333"/>
+          <w:sz w:val="22"/>
+          <w:szCs w:val="22"/>
+        </w:rPr>
+        <w:t xml:space="preserve"> adds T</w:t>
+      </w:r>
+      <w:r>
+        <w:rPr>
+          <w:rFonts w:ascii="Cambria" w:cs="Cambria" w:eastAsia="Cambria" w:hAnsi="Cambria"/>
+          <w:color w:val="333333"/>
+          <w:sz w:val="22"/>
+          <w:szCs w:val="22"/>
+          <w:vertAlign w:val="subscript"/>
+        </w:rPr>
+        <w:t xml:space="preserve">S</w:t>
+      </w:r>
+      <w:r>
+        <w:rPr>
+          <w:rFonts w:ascii="Cambria" w:cs="Cambria" w:eastAsia="Cambria" w:hAnsi="Cambria"/>
+          <w:color w:val="333333"/>
+          <w:sz w:val="22"/>
+          <w:szCs w:val="22"/>
+        </w:rPr>
+        <w:t xml:space="preserve">/2 to the delay (§3.2), so the conversion uses Δ + T</w:t>
+      </w:r>
+      <w:r>
+        <w:rPr>
+          <w:rFonts w:ascii="Cambria" w:cs="Cambria" w:eastAsia="Cambria" w:hAnsi="Cambria"/>
+          <w:color w:val="333333"/>
+          <w:sz w:val="22"/>
+          <w:szCs w:val="22"/>
+          <w:vertAlign w:val="subscript"/>
+        </w:rPr>
+        <w:t xml:space="preserve">S</w:t>
+      </w:r>
+      <w:r>
+        <w:rPr>
+          <w:rFonts w:ascii="Cambria" w:cs="Cambria" w:eastAsia="Cambria" w:hAnsi="Cambria"/>
+          <w:color w:val="333333"/>
+          <w:sz w:val="22"/>
+          <w:szCs w:val="22"/>
+        </w:rPr>
+        <w:t xml:space="preserve">/2. With central vision, Figure 4's κ = 0.2 and δ = 0.9 are K</w:t>
+      </w:r>
+      <w:r>
+        <w:rPr>
+          <w:rFonts w:ascii="Cambria" w:cs="Cambria" w:eastAsia="Cambria" w:hAnsi="Cambria"/>
+          <w:color w:val="333333"/>
+          <w:sz w:val="22"/>
+          <w:szCs w:val="22"/>
+          <w:vertAlign w:val="subscript"/>
+        </w:rPr>
+        <w:t xml:space="preserve">p</w:t>
+      </w:r>
+      <w:r>
+        <w:rPr>
+          <w:rFonts w:ascii="Cambria" w:cs="Cambria" w:eastAsia="Cambria" w:hAnsi="Cambria"/>
+          <w:color w:val="333333"/>
+          <w:sz w:val="22"/>
+          <w:szCs w:val="22"/>
+        </w:rPr>
+        <w:t xml:space="preserve"> = 0.2/0.155² = 8.3 s</w:t>
+      </w:r>
+      <w:r>
+        <w:rPr>
+          <w:rFonts w:ascii="Cambria" w:cs="Cambria" w:eastAsia="Cambria" w:hAnsi="Cambria"/>
+          <w:color w:val="333333"/>
+          <w:sz w:val="22"/>
+          <w:szCs w:val="22"/>
+          <w:vertAlign w:val="superscript"/>
+        </w:rPr>
+        <w:t xml:space="preserve">−2</w:t>
+      </w:r>
+      <w:r>
+        <w:rPr>
+          <w:rFonts w:ascii="Cambria" w:cs="Cambria" w:eastAsia="Cambria" w:hAnsi="Cambria"/>
+          <w:color w:val="333333"/>
+          <w:sz w:val="22"/>
+          <w:szCs w:val="22"/>
+        </w:rPr>
+        <w:t xml:space="preserve"> and K</w:t>
+      </w:r>
+      <w:r>
+        <w:rPr>
+          <w:rFonts w:ascii="Cambria" w:cs="Cambria" w:eastAsia="Cambria" w:hAnsi="Cambria"/>
+          <w:color w:val="333333"/>
+          <w:sz w:val="22"/>
+          <w:szCs w:val="22"/>
+          <w:vertAlign w:val="subscript"/>
+        </w:rPr>
+        <w:t xml:space="preserve">d</w:t>
+      </w:r>
+      <w:r>
+        <w:rPr>
+          <w:rFonts w:ascii="Cambria" w:cs="Cambria" w:eastAsia="Cambria" w:hAnsi="Cambria"/>
+          <w:color w:val="333333"/>
+          <w:sz w:val="22"/>
+          <w:szCs w:val="22"/>
+        </w:rPr>
+        <w:t xml:space="preserve"> = 0.9/0.155 = 5.8 s</w:t>
+      </w:r>
+      <w:r>
+        <w:rPr>
+          <w:rFonts w:ascii="Cambria" w:cs="Cambria" w:eastAsia="Cambria" w:hAnsi="Cambria"/>
+          <w:color w:val="333333"/>
+          <w:sz w:val="22"/>
+          <w:szCs w:val="22"/>
+          <w:vertAlign w:val="superscript"/>
+        </w:rPr>
+        <w:t xml:space="preserve">−1</w:t>
+      </w:r>
+      <w:r>
+        <w:rPr>
+          <w:rFonts w:ascii="Cambria" w:cs="Cambria" w:eastAsia="Cambria" w:hAnsi="Cambria"/>
+          <w:color w:val="333333"/>
+          <w:sz w:val="22"/>
+          <w:szCs w:val="22"/>
+        </w:rPr>
+        <w:t xml:space="preserve">.</w:t>
       </w:r>
     </w:p>
     <w:p>
@@ -6721,7 +6962,7 @@
           <w:sz w:val="22"/>
           <w:szCs w:val="22"/>
         </w:rPr>
-        <w:t xml:space="preserve">The overshoot grows in proportion to the unexpected delay, by 0.47 cm for every 10 ms with these gains (Figure 4C). Smaller gains shrink it, but no gain removes it. Over κ = 0.05 to 0.4 and δ = 0.5 to 1.25, the overshoot at 66 ms rises with either gain. Its smallest value is 1.7 cm, at κ = 0.05 and δ = 0.5.</w:t>
+        <w:t xml:space="preserve">The overshoot grows in proportion to the unexpected delay, by 0.47 cm for every 10 ms with these gains, and by 0.35 and 0.58 cm with δ = 0.5 and 1.25 (Figure 4C). Weaker gains shrink it, but none removes it. The 66 ms case was run with 15 gain pairs: κ = 0.05, 0.1, 0.2, 0.3, 0.4 with δ = 0.5, 0.9, 1.25, all stable (§3.3). The overshoot rose with either gain. It was smallest, 1.7 cm, at the weakest pair, κ = 0.05 and δ = 0.5.</w:t>
       </w:r>
     </w:p>
     <w:p>
@@ -6930,7 +7171,7 @@
           <w:sz w:val="19"/>
           <w:szCs w:val="19"/>
         </w:rPr>
-        <w:t xml:space="preserve">An unexpected delay. The 0° reach of 500 ms. The sensor's delay is 150 ms (central vision); the loop uses the noise-free velocity; there is no noise of any kind. A, B: gains κ = 0.2 and δ = 0.9 (§3). Teal: the controller reads the plan 150 ms back. Red, light to dark: it reads the plan 128, 106 or 84 ms back, as if the delay were 22, 44 or 66 ms shorter; 66 ms is the extra delay of Smith and Bowen's (1980) video. A: hand paths; the dotted line is the plan, and y is drawn at twice the scale of x. B: distance from the target over 1.5 s; the dotted line marks the end of the plan. C, D: the overshoot and the width of the sideways loop against the unexpected delay, for κ = 0.2 and three values of δ; the circle marks the 66 ms case of A and B.</w:t>
+        <w:t xml:space="preserve">An unexpected delay. The 0° reach of 500 ms. The sensor's delay is 150 ms (central vision); the loop uses the noise-free velocity; there is no noise of any kind. A, B: gains κ = 0.2 and δ = 0.9 (§2). Teal: the controller reads the plan 150 ms back. Red, light to dark: it reads the plan 128, 106 or 84 ms back, as if the delay were 22, 44 or 66 ms shorter; 66 ms is the extra delay of Smith and Bowen's (1980) video. A: hand paths; the dotted line is the plan, and y is drawn at twice the scale of x. B: distance from the target over 1.5 s; the dotted line marks the end of the plan. C, D: the overshoot and the width of the sideways loop against the unexpected delay, for κ = 0.2 and three values of δ; the circle marks the 66 ms case of A and B.</w:t>
       </w:r>
     </w:p>
     <w:p>
@@ -7040,7 +7281,7 @@
               </w:rPr>
               <w:t xml:space="preserve">This section finds the roots of the loop's characteristic equation and reads stability from them. The </w:t>
             </w:r>
-            <w:hyperlink w:history="1" r:id="rIdiqj0kk0z8d8y6c5fbeit3">
+            <w:hyperlink w:history="1" r:id="rIdgytsioir7jtwxnkvcbauj">
               <w:r>
                 <w:rPr>
                   <w:rFonts w:ascii="Cambria" w:cs="Cambria" w:eastAsia="Cambria" w:hAnsi="Cambria"/>
@@ -7410,7 +7651,7 @@
           <w:sz w:val="22"/>
           <w:szCs w:val="22"/>
         </w:rPr>
-        <w:t xml:space="preserve">Equation 8.4 holds in every direction alike, because the command was turned into torque with the arm's own mass matrix. K</w:t>
+        <w:t xml:space="preserve">Equation 8.4 holds in every direction alike, because the command was turned into torque with the arm's own mass matrix. With time measured in units of Δ, Equation 8.4 depends only on §2's dimensionless gains, κ = K</w:t>
       </w:r>
       <w:r>
         <w:rPr>
@@ -7429,7 +7670,7 @@
           <w:sz w:val="22"/>
           <w:szCs w:val="22"/>
         </w:rPr>
-        <w:t xml:space="preserve"> has units of 1/s² and K</w:t>
+        <w:t xml:space="preserve">Δ² and δ = K</w:t>
       </w:r>
       <w:r>
         <w:rPr>
@@ -7448,83 +7689,7 @@
           <w:sz w:val="22"/>
           <w:szCs w:val="22"/>
         </w:rPr>
-        <w:t xml:space="preserve"> of 1/s. Two dimensionless gains are useful: κ = K</w:t>
-      </w:r>
-      <w:r>
-        <w:rPr>
-          <w:rFonts w:ascii="Cambria" w:cs="Cambria" w:eastAsia="Cambria" w:hAnsi="Cambria"/>
-          <w:color w:val="333333"/>
-          <w:sz w:val="22"/>
-          <w:szCs w:val="22"/>
-          <w:vertAlign w:val="subscript"/>
-        </w:rPr>
-        <w:t xml:space="preserve">p</w:t>
-      </w:r>
-      <w:r>
-        <w:rPr>
-          <w:rFonts w:ascii="Cambria" w:cs="Cambria" w:eastAsia="Cambria" w:hAnsi="Cambria"/>
-          <w:color w:val="333333"/>
-          <w:sz w:val="22"/>
-          <w:szCs w:val="22"/>
-        </w:rPr>
-        <w:t xml:space="preserve">Δ² and δ = K</w:t>
-      </w:r>
-      <w:r>
-        <w:rPr>
-          <w:rFonts w:ascii="Cambria" w:cs="Cambria" w:eastAsia="Cambria" w:hAnsi="Cambria"/>
-          <w:color w:val="333333"/>
-          <w:sz w:val="22"/>
-          <w:szCs w:val="22"/>
-          <w:vertAlign w:val="subscript"/>
-        </w:rPr>
-        <w:t xml:space="preserve">d</w:t>
-      </w:r>
-      <w:r>
-        <w:rPr>
-          <w:rFonts w:ascii="Cambria" w:cs="Cambria" w:eastAsia="Cambria" w:hAnsi="Cambria"/>
-          <w:color w:val="333333"/>
-          <w:sz w:val="22"/>
-          <w:szCs w:val="22"/>
-        </w:rPr>
-        <w:t xml:space="preserve">Δ. In §1 the sensor also holds each sample for T</w:t>
-      </w:r>
-      <w:r>
-        <w:rPr>
-          <w:rFonts w:ascii="Cambria" w:cs="Cambria" w:eastAsia="Cambria" w:hAnsi="Cambria"/>
-          <w:color w:val="333333"/>
-          <w:sz w:val="22"/>
-          <w:szCs w:val="22"/>
-          <w:vertAlign w:val="subscript"/>
-        </w:rPr>
-        <w:t xml:space="preserve">S</w:t>
-      </w:r>
-      <w:r>
-        <w:rPr>
-          <w:rFonts w:ascii="Cambria" w:cs="Cambria" w:eastAsia="Cambria" w:hAnsi="Cambria"/>
-          <w:color w:val="333333"/>
-          <w:sz w:val="22"/>
-          <w:szCs w:val="22"/>
-        </w:rPr>
-        <w:t xml:space="preserve">, which acts like an extra delay of T</w:t>
-      </w:r>
-      <w:r>
-        <w:rPr>
-          <w:rFonts w:ascii="Cambria" w:cs="Cambria" w:eastAsia="Cambria" w:hAnsi="Cambria"/>
-          <w:color w:val="333333"/>
-          <w:sz w:val="22"/>
-          <w:szCs w:val="22"/>
-          <w:vertAlign w:val="subscript"/>
-        </w:rPr>
-        <w:t xml:space="preserve">S</w:t>
-      </w:r>
-      <w:r>
-        <w:rPr>
-          <w:rFonts w:ascii="Cambria" w:cs="Cambria" w:eastAsia="Cambria" w:hAnsi="Cambria"/>
-          <w:color w:val="333333"/>
-          <w:sz w:val="22"/>
-          <w:szCs w:val="22"/>
-        </w:rPr>
-        <w:t xml:space="preserve">/2 (§3.2).</w:t>
+        <w:t xml:space="preserve">Δ. That is why one map of stable gains serves every delay (§3.3).</w:t>
       </w:r>
     </w:p>
     <w:p>
@@ -10743,7 +10908,7 @@
           <w:sz w:val="22"/>
           <w:szCs w:val="22"/>
         </w:rPr>
-        <w:t xml:space="preserve">Paillard (1996) proposed that peripheral vision, which detects the hand's motion, supports faster corrections than central vision. In this model peripheral vision wins only when the velocity is known without the sensor's noise. How large its lead is depends on the 80 ms delay.</w:t>
+        <w:t xml:space="preserve">Paillard (1996) proposed that peripheral vision, which detects the hand's motion, supports faster corrections than central vision. In this model peripheral vision wins only when the velocity is known without the sensor's noise. How large its lead is depends on the assumed 80 ms delay.</w:t>
       </w:r>
     </w:p>
     <w:p>

</xml_diff>